<commit_message>
Carry the presenter's fee correction into the handout and add a print PDF
The out-of-pocket figure in the Q&A was too low; it is now 約1,442〜1,643円
per visit, including the regional adjustment and the 処遇改善加算Ⅱ, as
corrected in the Word copy. Applied to handout.html and the docx builder,
and 配布資料.pdf is the A4 duplex render, verified at two pages.

Co-Authored-By: Claude Opus 5 <noreply@anthropic.com>
Claude-Session: https://claude.ai/code/session_01EuVvTjbyv3WUxHVeG4YeGS
</commit_message>
<xml_diff>
--- a/配布資料.docx
+++ b/配布資料.docx
@@ -3564,7 +3564,7 @@
           <w:sz w:val="16"/>
           <w:szCs w:val="16"/>
         </w:rPr>
-        <w:t xml:space="preserve">介護保険適用で、1割負担の方は1回あたり約1,000〜1,300円が目安です。</w:t>
+        <w:t xml:space="preserve">介護保険適用で、1割負担の方は1回あたり約1,442〜1,643円が目安です（地域加算、介護職員等処遇改善加算Ⅱを含む）。</w:t>
       </w:r>
     </w:p>
     <w:p>
@@ -3824,10 +3824,6 @@
 </w:document>
 </file>
 
-<file path=word/comments.xml><?xml version="1.0" encoding="utf-8"?>
-<w:comments xmlns:cx="http://schemas.microsoft.com/office/drawing/2014/chartex" xmlns:cx1="http://schemas.microsoft.com/office/drawing/2015/9/8/chartex" xmlns:cx2="http://schemas.microsoft.com/office/drawing/2015/10/21/chartex" xmlns:cx3="http://schemas.microsoft.com/office/drawing/2016/5/9/chartex" xmlns:cx4="http://schemas.microsoft.com/office/drawing/2016/5/10/chartex" xmlns:cx5="http://schemas.microsoft.com/office/drawing/2016/5/11/chartex" xmlns:cx6="http://schemas.microsoft.com/office/drawing/2016/5/12/chartex" xmlns:cx7="http://schemas.microsoft.com/office/drawing/2016/5/13/chartex" xmlns:cx8="http://schemas.microsoft.com/office/drawing/2016/5/14/chartex" xmlns:mc="http://schemas.openxmlformats.org/markup-compatibility/2006" xmlns:aink="http://schemas.microsoft.com/office/drawing/2016/ink" xmlns:am3d="http://schemas.microsoft.com/office/drawing/2017/model3d" xmlns:o="urn:schemas-microsoft-com:office:office" xmlns:r="http://schemas.openxmlformats.org/officeDocument/2006/relationships" xmlns:m="http://schemas.openxmlformats.org/officeDocument/2006/math" xmlns:v="urn:schemas-microsoft-com:vml" xmlns:wp14="http://schemas.microsoft.com/office/word/2010/wordprocessingDrawing" xmlns:wp="http://schemas.openxmlformats.org/drawingml/2006/wordprocessingDrawing" xmlns:w10="urn:schemas-microsoft-com:office:word" xmlns:w="http://schemas.openxmlformats.org/wordprocessingml/2006/main" xmlns:w14="http://schemas.microsoft.com/office/word/2010/wordml" xmlns:w15="http://schemas.microsoft.com/office/word/2012/wordml" xmlns:w16cex="http://schemas.microsoft.com/office/word/2018/wordml/cex" xmlns:w16cid="http://schemas.microsoft.com/office/word/2016/wordml/cid" xmlns:w16="http://schemas.microsoft.com/office/word/2018/wordml" xmlns:w16sdtdh="http://schemas.microsoft.com/office/word/2020/wordml/sdtdatahash" xmlns:w16se="http://schemas.microsoft.com/office/word/2015/wordml/symex" xmlns:wpg="http://schemas.microsoft.com/office/word/2010/wordprocessingGroup" xmlns:wpi="http://schemas.microsoft.com/office/word/2010/wordprocessingInk" xmlns:wne="http://schemas.microsoft.com/office/word/2006/wordml" xmlns:wps="http://schemas.microsoft.com/office/word/2010/wordprocessingShape"/>
-</file>
-
 <file path=word/endnotes.xml><?xml version="1.0" encoding="utf-8"?>
 <w:endnotes xmlns:wpc="http://schemas.microsoft.com/office/word/2010/wordprocessingCanvas" xmlns:mc="http://schemas.openxmlformats.org/markup-compatibility/2006" xmlns:o="urn:schemas-microsoft-com:office:office" xmlns:r="http://schemas.openxmlformats.org/officeDocument/2006/relationships" xmlns:m="http://schemas.openxmlformats.org/officeDocument/2006/math" xmlns:v="urn:schemas-microsoft-com:vml" xmlns:wp14="http://schemas.microsoft.com/office/word/2010/wordprocessingDrawing" xmlns:wp="http://schemas.openxmlformats.org/drawingml/2006/wordprocessingDrawing" xmlns:w10="urn:schemas-microsoft-com:office:word" xmlns:w="http://schemas.openxmlformats.org/wordprocessingml/2006/main" xmlns:w14="http://schemas.microsoft.com/office/word/2010/wordml" xmlns:w15="http://schemas.microsoft.com/office/word/2012/wordml" xmlns:wpg="http://schemas.microsoft.com/office/word/2010/wordprocessingGroup" xmlns:wpi="http://schemas.microsoft.com/office/word/2010/wordprocessingInk" xmlns:wne="http://schemas.microsoft.com/office/word/2006/wordml" xmlns:wps="http://schemas.microsoft.com/office/word/2010/wordprocessingShape" mc:Ignorable="w14 w15 wp14">
   <w:endnote w:type="separator" w:id="-1">
@@ -3906,7 +3902,7 @@
 <w:numbering xmlns:wpc="http://schemas.microsoft.com/office/word/2010/wordprocessingCanvas" xmlns:mc="http://schemas.openxmlformats.org/markup-compatibility/2006" xmlns:o="urn:schemas-microsoft-com:office:office" xmlns:r="http://schemas.openxmlformats.org/officeDocument/2006/relationships" xmlns:m="http://schemas.openxmlformats.org/officeDocument/2006/math" xmlns:v="urn:schemas-microsoft-com:vml" xmlns:wp14="http://schemas.microsoft.com/office/word/2010/wordprocessingDrawing" xmlns:wp="http://schemas.openxmlformats.org/drawingml/2006/wordprocessingDrawing" xmlns:w10="urn:schemas-microsoft-com:office:word" xmlns:w="http://schemas.openxmlformats.org/wordprocessingml/2006/main" xmlns:w14="http://schemas.microsoft.com/office/word/2010/wordml" xmlns:w15="http://schemas.microsoft.com/office/word/2012/wordml" xmlns:wpg="http://schemas.microsoft.com/office/word/2010/wordprocessingGroup" xmlns:wpi="http://schemas.microsoft.com/office/word/2010/wordprocessingInk" xmlns:wne="http://schemas.microsoft.com/office/word/2006/wordml" xmlns:wps="http://schemas.microsoft.com/office/word/2010/wordprocessingShape" mc:Ignorable="w14 w15 wp14">
   <w:abstractNum w:abstractNumId="1" w15:restartNumberingAfterBreak="0">
     <w:multiLevelType w:val="hybridMultilevel"/>
-    <w:lvl w:ilvl="0" w15:tentative="1">
+    <w:lvl w:ilvl="0" w:tentative="1">
       <w:start w:val="1"/>
       <w:numFmt w:val="bullet"/>
       <w:lvlText w:val="●"/>
@@ -3915,7 +3911,7 @@
         <w:ind w:left="720" w:hanging="360"/>
       </w:pPr>
     </w:lvl>
-    <w:lvl w:ilvl="1" w15:tentative="1">
+    <w:lvl w:ilvl="1" w:tentative="1">
       <w:start w:val="1"/>
       <w:numFmt w:val="bullet"/>
       <w:lvlText w:val="○"/>
@@ -3924,7 +3920,7 @@
         <w:ind w:left="1440" w:hanging="360"/>
       </w:pPr>
     </w:lvl>
-    <w:lvl w:ilvl="2" w15:tentative="1">
+    <w:lvl w:ilvl="2" w:tentative="1">
       <w:start w:val="1"/>
       <w:numFmt w:val="bullet"/>
       <w:lvlText w:val="■"/>
@@ -3933,7 +3929,7 @@
         <w:ind w:left="2160" w:hanging="360"/>
       </w:pPr>
     </w:lvl>
-    <w:lvl w:ilvl="3" w15:tentative="1">
+    <w:lvl w:ilvl="3" w:tentative="1">
       <w:start w:val="1"/>
       <w:numFmt w:val="bullet"/>
       <w:lvlText w:val="●"/>
@@ -3942,7 +3938,7 @@
         <w:ind w:left="2880" w:hanging="360"/>
       </w:pPr>
     </w:lvl>
-    <w:lvl w:ilvl="4" w15:tentative="1">
+    <w:lvl w:ilvl="4" w:tentative="1">
       <w:start w:val="1"/>
       <w:numFmt w:val="bullet"/>
       <w:lvlText w:val="○"/>
@@ -3951,7 +3947,7 @@
         <w:ind w:left="3600" w:hanging="360"/>
       </w:pPr>
     </w:lvl>
-    <w:lvl w:ilvl="5" w15:tentative="1">
+    <w:lvl w:ilvl="5" w:tentative="1">
       <w:start w:val="1"/>
       <w:numFmt w:val="bullet"/>
       <w:lvlText w:val="■"/>
@@ -3960,7 +3956,7 @@
         <w:ind w:left="4320" w:hanging="360"/>
       </w:pPr>
     </w:lvl>
-    <w:lvl w:ilvl="6" w15:tentative="1">
+    <w:lvl w:ilvl="6" w:tentative="1">
       <w:start w:val="1"/>
       <w:numFmt w:val="bullet"/>
       <w:lvlText w:val="●"/>
@@ -3969,7 +3965,7 @@
         <w:ind w:left="5040" w:hanging="360"/>
       </w:pPr>
     </w:lvl>
-    <w:lvl w:ilvl="7" w15:tentative="1">
+    <w:lvl w:ilvl="7" w:tentative="1">
       <w:start w:val="1"/>
       <w:numFmt w:val="bullet"/>
       <w:lvlText w:val="●"/>
@@ -3978,7 +3974,7 @@
         <w:ind w:left="5760" w:hanging="360"/>
       </w:pPr>
     </w:lvl>
-    <w:lvl w:ilvl="8" w15:tentative="1">
+    <w:lvl w:ilvl="8" w:tentative="1">
       <w:start w:val="1"/>
       <w:numFmt w:val="bullet"/>
       <w:lvlText w:val="●"/>
@@ -4010,6 +4006,10 @@
     </w:rPrDefault>
     <w:pPrDefault/>
   </w:docDefaults>
+  <w:style w:type="paragraph" w:styleId="Normal" w:default="1">
+    <w:name w:val="Normal"/>
+    <w:qFormat/>
+  </w:style>
   <w:style w:type="paragraph" w:styleId="Title">
     <w:name w:val="Title"/>
     <w:basedOn w:val="Normal"/>
@@ -4182,4 +4182,294 @@
     </w:rPr>
   </w:style>
 </w:styles>
+</file>
+
+<file path=word/theme/theme1.xml><?xml version="1.0" encoding="utf-8"?>
+<a:theme xmlns:a="http://schemas.openxmlformats.org/drawingml/2006/main" name="Office Theme">
+  <a:themeElements>
+    <a:clrScheme name="Office">
+      <a:dk1>
+        <a:sysClr val="windowText" lastClr="000000"/>
+      </a:dk1>
+      <a:lt1>
+        <a:sysClr val="window" lastClr="FFFFFF"/>
+      </a:lt1>
+      <a:dk2>
+        <a:srgbClr val="44546A"/>
+      </a:dk2>
+      <a:lt2>
+        <a:srgbClr val="E7E6E6"/>
+      </a:lt2>
+      <a:accent1>
+        <a:srgbClr val="4472C4"/>
+      </a:accent1>
+      <a:accent2>
+        <a:srgbClr val="ED7D31"/>
+      </a:accent2>
+      <a:accent3>
+        <a:srgbClr val="A5A5A5"/>
+      </a:accent3>
+      <a:accent4>
+        <a:srgbClr val="FFC000"/>
+      </a:accent4>
+      <a:accent5>
+        <a:srgbClr val="5B9BD5"/>
+      </a:accent5>
+      <a:accent6>
+        <a:srgbClr val="70AD47"/>
+      </a:accent6>
+      <a:hlink>
+        <a:srgbClr val="0563C1"/>
+      </a:hlink>
+      <a:folHlink>
+        <a:srgbClr val="954F72"/>
+      </a:folHlink>
+    </a:clrScheme>
+    <a:fontScheme name="Office">
+      <a:majorFont>
+        <a:latin typeface="Calibri Light" panose="020F0302020204030204"/>
+        <a:ea typeface=""/>
+        <a:cs typeface=""/>
+        <a:font script="Jpan" typeface="游ゴシック Light"/>
+        <a:font script="Hang" typeface="맑은 고딕"/>
+        <a:font script="Hans" typeface="等线 Light"/>
+        <a:font script="Hant" typeface="新細明體"/>
+        <a:font script="Arab" typeface="Times New Roman"/>
+        <a:font script="Hebr" typeface="Times New Roman"/>
+        <a:font script="Thai" typeface="Angsana New"/>
+        <a:font script="Ethi" typeface="Nyala"/>
+        <a:font script="Beng" typeface="Vrinda"/>
+        <a:font script="Gujr" typeface="Shruti"/>
+        <a:font script="Khmr" typeface="MoolBoran"/>
+        <a:font script="Knda" typeface="Tunga"/>
+        <a:font script="Guru" typeface="Raavi"/>
+        <a:font script="Cans" typeface="Euphemia"/>
+        <a:font script="Cher" typeface="Plantagenet Cherokee"/>
+        <a:font script="Yiii" typeface="Microsoft Yi Baiti"/>
+        <a:font script="Tibt" typeface="Microsoft Himalaya"/>
+        <a:font script="Thaa" typeface="MV Boli"/>
+        <a:font script="Deva" typeface="Mangal"/>
+        <a:font script="Telu" typeface="Gautami"/>
+        <a:font script="Taml" typeface="Latha"/>
+        <a:font script="Syrc" typeface="Estrangelo Edessa"/>
+        <a:font script="Orya" typeface="Kalinga"/>
+        <a:font script="Mlym" typeface="Kartika"/>
+        <a:font script="Laoo" typeface="DokChampa"/>
+        <a:font script="Sinh" typeface="Iskoola Pota"/>
+        <a:font script="Mong" typeface="Mongolian Baiti"/>
+        <a:font script="Viet" typeface="Times New Roman"/>
+        <a:font script="Uigh" typeface="Microsoft Uighur"/>
+        <a:font script="Geor" typeface="Sylfaen"/>
+        <a:font script="Armn" typeface="Arial"/>
+        <a:font script="Bugi" typeface="Leelawadee UI"/>
+        <a:font script="Bopo" typeface="Microsoft JhengHei"/>
+        <a:font script="Java" typeface="Javanese Text"/>
+        <a:font script="Lisu" typeface="Segoe UI"/>
+        <a:font script="Mymr" typeface="Myanmar Text"/>
+        <a:font script="Nkoo" typeface="Ebrima"/>
+        <a:font script="Olck" typeface="Nirmala UI"/>
+        <a:font script="Osma" typeface="Ebrima"/>
+        <a:font script="Phag" typeface="Phagspa"/>
+        <a:font script="Syrn" typeface="Estrangelo Edessa"/>
+        <a:font script="Syrj" typeface="Estrangelo Edessa"/>
+        <a:font script="Syre" typeface="Estrangelo Edessa"/>
+        <a:font script="Sora" typeface="Nirmala UI"/>
+        <a:font script="Tale" typeface="Microsoft Tai Le"/>
+        <a:font script="Talu" typeface="Microsoft New Tai Lue"/>
+        <a:font script="Tfng" typeface="Ebrima"/>
+      </a:majorFont>
+      <a:minorFont>
+        <a:latin typeface="Calibri" panose="020F0502020204030204"/>
+        <a:ea typeface=""/>
+        <a:cs typeface=""/>
+        <a:font script="Jpan" typeface="游明朝"/>
+        <a:font script="Hang" typeface="맑은 고딕"/>
+        <a:font script="Hans" typeface="等线"/>
+        <a:font script="Hant" typeface="新細明體"/>
+        <a:font script="Arab" typeface="Arial"/>
+        <a:font script="Hebr" typeface="Arial"/>
+        <a:font script="Thai" typeface="Cordia New"/>
+        <a:font script="Ethi" typeface="Nyala"/>
+        <a:font script="Beng" typeface="Vrinda"/>
+        <a:font script="Gujr" typeface="Shruti"/>
+        <a:font script="Khmr" typeface="DaunPenh"/>
+        <a:font script="Knda" typeface="Tunga"/>
+        <a:font script="Guru" typeface="Raavi"/>
+        <a:font script="Cans" typeface="Euphemia"/>
+        <a:font script="Cher" typeface="Plantagenet Cherokee"/>
+        <a:font script="Yiii" typeface="Microsoft Yi Baiti"/>
+        <a:font script="Tibt" typeface="Microsoft Himalaya"/>
+        <a:font script="Thaa" typeface="MV Boli"/>
+        <a:font script="Deva" typeface="Mangal"/>
+        <a:font script="Telu" typeface="Gautami"/>
+        <a:font script="Taml" typeface="Latha"/>
+        <a:font script="Syrc" typeface="Estrangelo Edessa"/>
+        <a:font script="Orya" typeface="Kalinga"/>
+        <a:font script="Mlym" typeface="Kartika"/>
+        <a:font script="Laoo" typeface="DokChampa"/>
+        <a:font script="Sinh" typeface="Iskoola Pota"/>
+        <a:font script="Mong" typeface="Mongolian Baiti"/>
+        <a:font script="Viet" typeface="Arial"/>
+        <a:font script="Uigh" typeface="Microsoft Uighur"/>
+        <a:font script="Geor" typeface="Sylfaen"/>
+        <a:font script="Armn" typeface="Arial"/>
+        <a:font script="Bugi" typeface="Leelawadee UI"/>
+        <a:font script="Bopo" typeface="Microsoft JhengHei"/>
+        <a:font script="Java" typeface="Javanese Text"/>
+        <a:font script="Lisu" typeface="Segoe UI"/>
+        <a:font script="Mymr" typeface="Myanmar Text"/>
+        <a:font script="Nkoo" typeface="Ebrima"/>
+        <a:font script="Olck" typeface="Nirmala UI"/>
+        <a:font script="Osma" typeface="Ebrima"/>
+        <a:font script="Phag" typeface="Phagspa"/>
+        <a:font script="Syrn" typeface="Estrangelo Edessa"/>
+        <a:font script="Syrj" typeface="Estrangelo Edessa"/>
+        <a:font script="Syre" typeface="Estrangelo Edessa"/>
+        <a:font script="Sora" typeface="Nirmala UI"/>
+        <a:font script="Tale" typeface="Microsoft Tai Le"/>
+        <a:font script="Talu" typeface="Microsoft New Tai Lue"/>
+        <a:font script="Tfng" typeface="Ebrima"/>
+      </a:minorFont>
+    </a:fontScheme>
+    <a:fmtScheme name="Office">
+      <a:fillStyleLst>
+        <a:solidFill>
+          <a:schemeClr val="phClr"/>
+        </a:solidFill>
+        <a:gradFill rotWithShape="true">
+          <a:gsLst>
+            <a:gs pos="0">
+              <a:schemeClr val="phClr">
+                <a:lumMod val="110000"/>
+                <a:satMod val="105000"/>
+                <a:tint val="67000"/>
+              </a:schemeClr>
+            </a:gs>
+            <a:gs pos="50000">
+              <a:schemeClr val="phClr">
+                <a:lumMod val="105000"/>
+                <a:satMod val="103000"/>
+                <a:tint val="73000"/>
+              </a:schemeClr>
+            </a:gs>
+            <a:gs pos="100000">
+              <a:schemeClr val="phClr">
+                <a:lumMod val="105000"/>
+                <a:satMod val="109000"/>
+                <a:tint val="81000"/>
+              </a:schemeClr>
+            </a:gs>
+          </a:gsLst>
+          <a:lin ang="5400000" scaled="false"/>
+        </a:gradFill>
+        <a:gradFill rotWithShape="true">
+          <a:gsLst>
+            <a:gs pos="0">
+              <a:schemeClr val="phClr">
+                <a:satMod val="103000"/>
+                <a:lumMod val="102000"/>
+                <a:tint val="94000"/>
+              </a:schemeClr>
+            </a:gs>
+            <a:gs pos="50000">
+              <a:schemeClr val="phClr">
+                <a:satMod val="110000"/>
+                <a:lumMod val="100000"/>
+                <a:shade val="100000"/>
+              </a:schemeClr>
+            </a:gs>
+            <a:gs pos="100000">
+              <a:schemeClr val="phClr">
+                <a:lumMod val="99000"/>
+                <a:satMod val="120000"/>
+                <a:shade val="78000"/>
+              </a:schemeClr>
+            </a:gs>
+          </a:gsLst>
+          <a:lin ang="5400000" scaled="false"/>
+        </a:gradFill>
+      </a:fillStyleLst>
+      <a:lnStyleLst>
+        <a:ln w="6350" cap="flat" cmpd="sng" algn="ctr">
+          <a:solidFill>
+            <a:schemeClr val="phClr"/>
+          </a:solidFill>
+          <a:prstDash val="solid"/>
+          <a:miter lim="800000"/>
+        </a:ln>
+        <a:ln w="12700" cap="flat" cmpd="sng" algn="ctr">
+          <a:solidFill>
+            <a:schemeClr val="phClr"/>
+          </a:solidFill>
+          <a:prstDash val="solid"/>
+          <a:miter lim="800000"/>
+        </a:ln>
+        <a:ln w="19050" cap="flat" cmpd="sng" algn="ctr">
+          <a:solidFill>
+            <a:schemeClr val="phClr"/>
+          </a:solidFill>
+          <a:prstDash val="solid"/>
+          <a:miter lim="800000"/>
+        </a:ln>
+      </a:lnStyleLst>
+      <a:effectStyleLst>
+        <a:effectStyle>
+          <a:effectLst/>
+        </a:effectStyle>
+        <a:effectStyle>
+          <a:effectLst/>
+        </a:effectStyle>
+        <a:effectStyle>
+          <a:effectLst>
+            <a:outerShdw blurRad="57150" dist="19050" dir="5400000" algn="ctr" rotWithShape="false">
+              <a:srgbClr val="000000">
+                <a:alpha val="63000"/>
+              </a:srgbClr>
+            </a:outerShdw>
+          </a:effectLst>
+        </a:effectStyle>
+      </a:effectStyleLst>
+      <a:bgFillStyleLst>
+        <a:solidFill>
+          <a:schemeClr val="phClr"/>
+        </a:solidFill>
+        <a:solidFill>
+          <a:schemeClr val="phClr">
+            <a:tint val="95000"/>
+            <a:satMod val="170000"/>
+          </a:schemeClr>
+        </a:solidFill>
+        <a:gradFill rotWithShape="true">
+          <a:gsLst>
+            <a:gs pos="0">
+              <a:schemeClr val="phClr">
+                <a:tint val="93000"/>
+                <a:satMod val="150000"/>
+                <a:shade val="98000"/>
+                <a:lumMod val="102000"/>
+              </a:schemeClr>
+            </a:gs>
+            <a:gs pos="50000">
+              <a:schemeClr val="phClr">
+                <a:tint val="98000"/>
+                <a:satMod val="130000"/>
+                <a:shade val="90000"/>
+                <a:lumMod val="103000"/>
+              </a:schemeClr>
+            </a:gs>
+            <a:gs pos="100000">
+              <a:schemeClr val="phClr">
+                <a:shade val="63000"/>
+                <a:satMod val="120000"/>
+              </a:schemeClr>
+            </a:gs>
+          </a:gsLst>
+          <a:lin ang="5400000" scaled="false"/>
+        </a:gradFill>
+      </a:bgFillStyleLst>
+    </a:fmtScheme>
+  </a:themeElements>
+  <a:objectDefaults/>
+  <a:extraClrSchemeLst/>
+</a:theme>
 </file>
</xml_diff>

<commit_message>
Carry the role-division rewrite onto the slide and the handout
The script was reworded earlier but slide 9 and handout section 05 still
read "医療行為は行えません" and listed 薬剤の塗布 as the nurse's job — the
screen would have contradicted the speaker. Both now say the two services
differ in scope, list the ointment (outside pressure-ulcer care) and
emergency suction on the home-bathing side, and ask visiting nursing for
the continuing treatment. Section 05 is re-tightened to four lines a
column so page 1 still holds it; verified by rendering.

Co-Authored-By: Claude Opus 5 <noreply@anthropic.com>
Claude-Session: https://claude.ai/code/session_01EuVvTjbyv3WUxHVeG4YeGS
</commit_message>
<xml_diff>
--- a/配布資料.docx
+++ b/配布資料.docx
@@ -2397,7 +2397,7 @@
           <w:sz w:val="16"/>
           <w:szCs w:val="16"/>
         </w:rPr>
-        <w:t xml:space="preserve">訪問入浴は介護保険サービスのため医療行為は行えません。異常を見つけて訪問看護・主治医へつなぐのが役割です。</w:t>
+        <w:t xml:space="preserve">訪問入浴と訪問看護は担う範囲が違います。「できない」のではなく、継続的に担うのが役割ではありません。</w:t>
       </w:r>
     </w:p>
     <w:tbl>
@@ -2511,7 +2511,7 @@
                 <w:sz w:val="16"/>
                 <w:szCs w:val="16"/>
               </w:rPr>
-              <w:t xml:space="preserve">洗身・洗髪と日常的な保湿ケア</w:t>
+              <w:t xml:space="preserve">洗身・洗髪、保湿、処方薬の塗布（褥瘡の処置を除く）</w:t>
             </w:r>
           </w:p>
           <w:p>
@@ -2534,7 +2534,7 @@
                 <w:sz w:val="16"/>
                 <w:szCs w:val="16"/>
               </w:rPr>
-              <w:t xml:space="preserve">観察所見の記録と当日中の報告</w:t>
+              <w:t xml:space="preserve">急変時の応急対応・吸引、記録と当日中の報告</w:t>
             </w:r>
           </w:p>
         </w:tc>
@@ -2563,7 +2563,7 @@
                 <w:sz w:val="18"/>
                 <w:szCs w:val="18"/>
               </w:rPr>
-              <w:t xml:space="preserve">訪問看護におつなぎすること</w:t>
+              <w:t xml:space="preserve">訪問看護にお願いしたいこと</w:t>
             </w:r>
           </w:p>
           <w:p>
@@ -2586,7 +2586,7 @@
                 <w:sz w:val="16"/>
                 <w:szCs w:val="16"/>
               </w:rPr>
-              <w:t xml:space="preserve">褥瘡・創傷の処置、薬剤の塗布</w:t>
+              <w:t xml:space="preserve">褥瘡・創傷の継続的な処置</w:t>
             </w:r>
           </w:p>
           <w:p>
@@ -2632,7 +2632,7 @@
                 <w:sz w:val="16"/>
                 <w:szCs w:val="16"/>
               </w:rPr>
-              <w:t xml:space="preserve">喀痰吸引・経管栄養の管理</w:t>
+              <w:t xml:space="preserve">計画的な喀痰吸引・経管栄養の管理</w:t>
             </w:r>
           </w:p>
           <w:p>
@@ -2655,7 +2655,7 @@
                 <w:sz w:val="16"/>
                 <w:szCs w:val="16"/>
               </w:rPr>
-              <w:t xml:space="preserve">医師の指示に基づく医療的ケア全般</w:t>
+              <w:t xml:space="preserve">医師の指示に基づく計画的な医療的ケア</w:t>
             </w:r>
           </w:p>
         </w:tc>
@@ -3668,7 +3668,7 @@
           <w:sz w:val="16"/>
           <w:szCs w:val="16"/>
         </w:rPr>
-        <w:t xml:space="preserve">訪問入浴は介護保険サービスのため医療行為は行えません。処置が必要な場合は訪問看護と連携し、入浴日に合わせてご訪問いただく形をおすすめしています。</w:t>
+        <w:t xml:space="preserve">看護師が同行していますので、処方された軟膏の塗布（褥瘡の処置を除く）や急変時の応急対応は行います。一方、継続的な処置は訪問看護の役割です。入浴日に合わせてご訪問いただく形をおすすめしています。</w:t>
       </w:r>
     </w:p>
     <w:p>

</xml_diff>

<commit_message>
Record that the team relieves pressure and protects on the spot
The nurse does act on a reddened sacrum — offloading, protecting — and
the script, slide 9, the summary slide and the handout now say so rather
than stopping at "we record and report". The summary's fourth point no
longer claims the service performs no medical acts. Section 01 of the
handout drops a sentence that 04 and 05 already carry, which buys the
line the longer list needs.

Also removes two stale blocks left in プレゼン台本.txt by a bad section
replacement: the old slide 9 body and a duplicate of the demo section.

Co-Authored-By: Claude Opus 5 <noreply@anthropic.com>
Claude-Session: https://claude.ai/code/session_01EuVvTjbyv3WUxHVeG4YeGS
</commit_message>
<xml_diff>
--- a/配布資料.docx
+++ b/配布資料.docx
@@ -90,7 +90,7 @@
           <w:sz w:val="18"/>
           <w:szCs w:val="18"/>
         </w:rPr>
-        <w:t xml:space="preserve">看護師1名＋介護スタッフ2名の3名チーム（厚生労働省令で定められた体制）が、専用の組立式浴槽を車両で持参してご自宅を訪問し、居室で全身浴を提供する介護保険サービスです。ベッドサイドに約2畳のスペースがあれば、浴室の広さや段差にかかわらず実施できます。入浴前後は看護師が入浴可否を判断し、異常があれば清拭・部分浴へ切り替えて関係職種へ報告します。</w:t>
+        <w:t xml:space="preserve">看護師1名＋介護スタッフ2名の3名チーム（厚生労働省令で定められた体制）が、専用の組立式浴槽を車両で持参してご自宅を訪問し、居室で全身浴を提供する介護保険サービスです。ベッドサイドに約2畳のスペースがあれば、浴室の広さや段差にかかわらず実施できます。</w:t>
       </w:r>
     </w:p>
     <w:p>
@@ -2534,7 +2534,30 @@
                 <w:sz w:val="16"/>
                 <w:szCs w:val="16"/>
               </w:rPr>
-              <w:t xml:space="preserve">急変時の応急対応・吸引、記録と当日中の報告</w:t>
+              <w:t xml:space="preserve">発赤時の除圧・保護、急変時の応急対応・吸引</w:t>
+            </w:r>
+          </w:p>
+          <w:p>
+            <w:pPr>
+              <w:spacing w:after="0" w:before="0" w:line="240"/>
+            </w:pPr>
+            <w:r>
+              <w:rPr>
+                <w:rFonts w:ascii="Meiryo" w:cs="Meiryo" w:eastAsia="Meiryo" w:hAnsi="Meiryo"/>
+                <w:color w:val="1C2833"/>
+                <w:sz w:val="16"/>
+                <w:szCs w:val="16"/>
+              </w:rPr>
+              <w:t xml:space="preserve">・</w:t>
+            </w:r>
+            <w:r>
+              <w:rPr>
+                <w:rFonts w:ascii="Meiryo" w:cs="Meiryo" w:eastAsia="Meiryo" w:hAnsi="Meiryo"/>
+                <w:color w:val="1C2833"/>
+                <w:sz w:val="16"/>
+                <w:szCs w:val="16"/>
+              </w:rPr>
+              <w:t xml:space="preserve">観察所見の記録と当日中の報告</w:t>
             </w:r>
           </w:p>
         </w:tc>

</xml_diff>